<commit_message>
added Repository Link to the report file.
</commit_message>
<xml_diff>
--- a/docs/Hotel_Reservation_System.docx
+++ b/docs/Hotel_Reservation_System.docx
@@ -577,6 +577,75 @@
         <w:br/>
         <w:t>26/04/2026</w:t>
       </w:r>
+      <w:r>
+        <w:rPr>
+          <w:rFonts w:asciiTheme="majorBidi" w:eastAsia="Aptos" w:hAnsiTheme="majorBidi" w:cstheme="majorBidi"/>
+          <w:b/>
+          <w:bCs/>
+          <w:sz w:val="32"/>
+          <w:szCs w:val="32"/>
+        </w:rPr>
+        <w:br/>
+      </w:r>
+      <w:r>
+        <w:rPr>
+          <w:rFonts w:asciiTheme="majorBidi" w:eastAsia="Aptos" w:hAnsiTheme="majorBidi" w:cstheme="majorBidi"/>
+          <w:b/>
+          <w:bCs/>
+          <w:sz w:val="32"/>
+          <w:szCs w:val="32"/>
+        </w:rPr>
+        <w:br/>
+      </w:r>
+      <w:r>
+        <w:rPr>
+          <w:rFonts w:asciiTheme="majorBidi" w:hAnsiTheme="majorBidi" w:cstheme="majorBidi"/>
+          <w:b/>
+          <w:bCs/>
+          <w:sz w:val="32"/>
+          <w:szCs w:val="32"/>
+        </w:rPr>
+        <w:t>GitHub Repository:</w:t>
+      </w:r>
+      <w:r>
+        <w:rPr>
+          <w:rFonts w:asciiTheme="majorBidi" w:hAnsiTheme="majorBidi" w:cstheme="majorBidi"/>
+          <w:b/>
+          <w:bCs/>
+          <w:sz w:val="32"/>
+          <w:szCs w:val="32"/>
+        </w:rPr>
+        <w:br/>
+      </w:r>
+      <w:hyperlink r:id="rId6" w:history="1">
+        <w:r>
+          <w:rPr>
+            <w:rStyle w:val="Hyperlink"/>
+            <w:rFonts w:asciiTheme="majorBidi" w:hAnsiTheme="majorBidi" w:cstheme="majorBidi"/>
+          </w:rPr>
+          <w:t>https://github.com/danielmourad376/Desktop__Hotel__Reservation_</w:t>
+        </w:r>
+        <w:r>
+          <w:rPr>
+            <w:rStyle w:val="Hyperlink"/>
+            <w:rFonts w:asciiTheme="majorBidi" w:hAnsiTheme="majorBidi" w:cstheme="majorBidi"/>
+          </w:rPr>
+          <w:t>_</w:t>
+        </w:r>
+        <w:r>
+          <w:rPr>
+            <w:rStyle w:val="Hyperlink"/>
+            <w:rFonts w:asciiTheme="majorBidi" w:hAnsiTheme="majorBidi" w:cstheme="majorBidi"/>
+          </w:rPr>
+          <w:t>System.git</w:t>
+        </w:r>
+      </w:hyperlink>
+      <w:r>
+        <w:rPr>
+          <w:rFonts w:asciiTheme="majorBidi" w:hAnsiTheme="majorBidi" w:cstheme="majorBidi"/>
+        </w:rPr>
+        <w:t xml:space="preserve"> </w:t>
+      </w:r>
     </w:p>
     <w:p>
       <w:pPr>
@@ -749,7 +818,21 @@
         <w:rPr>
           <w:rFonts w:asciiTheme="majorBidi" w:hAnsiTheme="majorBidi" w:cstheme="majorBidi"/>
         </w:rPr>
-        <w:t>model. Authored foundational enumerations (Gender, Role, PaymentMethod). Architected the primary application</w:t>
+        <w:t xml:space="preserve">model. Authored foundational enumerations (Gender, Role, </w:t>
+      </w:r>
+      <w:proofErr w:type="spellStart"/>
+      <w:r>
+        <w:rPr>
+          <w:rFonts w:asciiTheme="majorBidi" w:hAnsiTheme="majorBidi" w:cstheme="majorBidi"/>
+        </w:rPr>
+        <w:t>PaymentMethod</w:t>
+      </w:r>
+      <w:proofErr w:type="spellEnd"/>
+      <w:r>
+        <w:rPr>
+          <w:rFonts w:asciiTheme="majorBidi" w:hAnsiTheme="majorBidi" w:cstheme="majorBidi"/>
+        </w:rPr>
+        <w:t>). Architected the primary application</w:t>
       </w:r>
       <w:r>
         <w:rPr>
@@ -761,7 +844,63 @@
         <w:rPr>
           <w:rFonts w:asciiTheme="majorBidi" w:hAnsiTheme="majorBidi" w:cstheme="majorBidi"/>
         </w:rPr>
-        <w:t>(Main) and the modular Admin Command Line Interface (AdminMenu, AdminRoomMenu, AdminViewMenu, ViewData).</w:t>
+        <w:t>(Main) and the modular Admin Command Line Interface (</w:t>
+      </w:r>
+      <w:proofErr w:type="spellStart"/>
+      <w:r>
+        <w:rPr>
+          <w:rFonts w:asciiTheme="majorBidi" w:hAnsiTheme="majorBidi" w:cstheme="majorBidi"/>
+        </w:rPr>
+        <w:t>AdminMenu</w:t>
+      </w:r>
+      <w:proofErr w:type="spellEnd"/>
+      <w:r>
+        <w:rPr>
+          <w:rFonts w:asciiTheme="majorBidi" w:hAnsiTheme="majorBidi" w:cstheme="majorBidi"/>
+        </w:rPr>
+        <w:t xml:space="preserve">, </w:t>
+      </w:r>
+      <w:proofErr w:type="spellStart"/>
+      <w:r>
+        <w:rPr>
+          <w:rFonts w:asciiTheme="majorBidi" w:hAnsiTheme="majorBidi" w:cstheme="majorBidi"/>
+        </w:rPr>
+        <w:t>AdminRoomMenu</w:t>
+      </w:r>
+      <w:proofErr w:type="spellEnd"/>
+      <w:r>
+        <w:rPr>
+          <w:rFonts w:asciiTheme="majorBidi" w:hAnsiTheme="majorBidi" w:cstheme="majorBidi"/>
+        </w:rPr>
+        <w:t xml:space="preserve">, </w:t>
+      </w:r>
+      <w:proofErr w:type="spellStart"/>
+      <w:r>
+        <w:rPr>
+          <w:rFonts w:asciiTheme="majorBidi" w:hAnsiTheme="majorBidi" w:cstheme="majorBidi"/>
+        </w:rPr>
+        <w:t>AdminViewMenu</w:t>
+      </w:r>
+      <w:proofErr w:type="spellEnd"/>
+      <w:r>
+        <w:rPr>
+          <w:rFonts w:asciiTheme="majorBidi" w:hAnsiTheme="majorBidi" w:cstheme="majorBidi"/>
+        </w:rPr>
+        <w:t xml:space="preserve">, </w:t>
+      </w:r>
+      <w:proofErr w:type="spellStart"/>
+      <w:r>
+        <w:rPr>
+          <w:rFonts w:asciiTheme="majorBidi" w:hAnsiTheme="majorBidi" w:cstheme="majorBidi"/>
+        </w:rPr>
+        <w:t>ViewData</w:t>
+      </w:r>
+      <w:proofErr w:type="spellEnd"/>
+      <w:r>
+        <w:rPr>
+          <w:rFonts w:asciiTheme="majorBidi" w:hAnsiTheme="majorBidi" w:cstheme="majorBidi"/>
+        </w:rPr>
+        <w:t>).</w:t>
       </w:r>
     </w:p>
     <w:p>
@@ -796,7 +935,21 @@
         <w:rPr>
           <w:rFonts w:asciiTheme="majorBidi" w:hAnsiTheme="majorBidi" w:cstheme="majorBidi"/>
         </w:rPr>
-        <w:t>Developed the Guest domain model and its corresponding GuestMenu Command Line Interface, handling the core logic for user-facing room browsing, profile management, and wallet balance adjustments.</w:t>
+        <w:t xml:space="preserve">Developed the Guest domain model and its corresponding </w:t>
+      </w:r>
+      <w:proofErr w:type="spellStart"/>
+      <w:r>
+        <w:rPr>
+          <w:rFonts w:asciiTheme="majorBidi" w:hAnsiTheme="majorBidi" w:cstheme="majorBidi"/>
+        </w:rPr>
+        <w:t>GuestMenu</w:t>
+      </w:r>
+      <w:proofErr w:type="spellEnd"/>
+      <w:r>
+        <w:rPr>
+          <w:rFonts w:asciiTheme="majorBidi" w:hAnsiTheme="majorBidi" w:cstheme="majorBidi"/>
+        </w:rPr>
+        <w:t xml:space="preserve"> Command Line Interface, handling the core logic for user-facing room browsing, profile management, and wallet balance adjustments.</w:t>
       </w:r>
     </w:p>
     <w:p>
@@ -831,7 +984,35 @@
         <w:rPr>
           <w:rFonts w:asciiTheme="majorBidi" w:hAnsiTheme="majorBidi" w:cstheme="majorBidi"/>
         </w:rPr>
-        <w:t>Architected the booking lifecycle, supplemental inventory models, and financial processing systems. Built the RoomType, Amenity, Reservation, and Invoice classes. Additionally, realized the Payable interface and ReservationStatus enumeration to standardize checkout protocols.</w:t>
+        <w:t xml:space="preserve">Architected the booking lifecycle, supplemental inventory models, and financial processing systems. Built the </w:t>
+      </w:r>
+      <w:proofErr w:type="spellStart"/>
+      <w:r>
+        <w:rPr>
+          <w:rFonts w:asciiTheme="majorBidi" w:hAnsiTheme="majorBidi" w:cstheme="majorBidi"/>
+        </w:rPr>
+        <w:t>RoomType</w:t>
+      </w:r>
+      <w:proofErr w:type="spellEnd"/>
+      <w:r>
+        <w:rPr>
+          <w:rFonts w:asciiTheme="majorBidi" w:hAnsiTheme="majorBidi" w:cstheme="majorBidi"/>
+        </w:rPr>
+        <w:t xml:space="preserve">, Amenity, Reservation, and Invoice classes. Additionally, realized the Payable interface and </w:t>
+      </w:r>
+      <w:proofErr w:type="spellStart"/>
+      <w:r>
+        <w:rPr>
+          <w:rFonts w:asciiTheme="majorBidi" w:hAnsiTheme="majorBidi" w:cstheme="majorBidi"/>
+        </w:rPr>
+        <w:t>ReservationStatus</w:t>
+      </w:r>
+      <w:proofErr w:type="spellEnd"/>
+      <w:r>
+        <w:rPr>
+          <w:rFonts w:asciiTheme="majorBidi" w:hAnsiTheme="majorBidi" w:cstheme="majorBidi"/>
+        </w:rPr>
+        <w:t xml:space="preserve"> enumeration to standardize checkout protocols.</w:t>
       </w:r>
     </w:p>
     <w:p>
@@ -864,7 +1045,35 @@
         <w:rPr>
           <w:rFonts w:asciiTheme="majorBidi" w:hAnsiTheme="majorBidi" w:cstheme="majorBidi"/>
         </w:rPr>
-        <w:t>Designed the centralized HotelDatabase utilizing the Singleton design pattern to act as the in-memory data store. Engineered the HotelDatabaseSearch utility class to handle complex algorithms (such as date-overlap validation) and decouple data storage from query logic.</w:t>
+        <w:t xml:space="preserve">Designed the centralized </w:t>
+      </w:r>
+      <w:proofErr w:type="spellStart"/>
+      <w:r>
+        <w:rPr>
+          <w:rFonts w:asciiTheme="majorBidi" w:hAnsiTheme="majorBidi" w:cstheme="majorBidi"/>
+        </w:rPr>
+        <w:t>HotelDatabase</w:t>
+      </w:r>
+      <w:proofErr w:type="spellEnd"/>
+      <w:r>
+        <w:rPr>
+          <w:rFonts w:asciiTheme="majorBidi" w:hAnsiTheme="majorBidi" w:cstheme="majorBidi"/>
+        </w:rPr>
+        <w:t xml:space="preserve"> utilizing the Singleton design pattern to act as the in-memory data store. Engineered the </w:t>
+      </w:r>
+      <w:proofErr w:type="spellStart"/>
+      <w:r>
+        <w:rPr>
+          <w:rFonts w:asciiTheme="majorBidi" w:hAnsiTheme="majorBidi" w:cstheme="majorBidi"/>
+        </w:rPr>
+        <w:t>HotelDatabaseSearch</w:t>
+      </w:r>
+      <w:proofErr w:type="spellEnd"/>
+      <w:r>
+        <w:rPr>
+          <w:rFonts w:asciiTheme="majorBidi" w:hAnsiTheme="majorBidi" w:cstheme="majorBidi"/>
+        </w:rPr>
+        <w:t xml:space="preserve"> utility class to handle complex algorithms (such as date-overlap validation) and decouple data storage from query logic.</w:t>
       </w:r>
     </w:p>
     <w:p>
@@ -905,8 +1114,44 @@
         <w:rPr>
           <w:rFonts w:asciiTheme="majorBidi" w:hAnsiTheme="majorBidi" w:cstheme="majorBidi"/>
         </w:rPr>
-        <w:t>Engineered the system's custom exception handling architecture (e.g., InvalidCheckOutException, InvalidPaymentException), ensuring predictable error</w:t>
-      </w:r>
+        <w:t xml:space="preserve">Engineered the system's custom exception handling architecture (e.g., </w:t>
+      </w:r>
+      <w:proofErr w:type="spellStart"/>
+      <w:r>
+        <w:rPr>
+          <w:rFonts w:asciiTheme="majorBidi" w:hAnsiTheme="majorBidi" w:cstheme="majorBidi"/>
+        </w:rPr>
+        <w:t>InvalidCheckOutException</w:t>
+      </w:r>
+      <w:proofErr w:type="spellEnd"/>
+      <w:r>
+        <w:rPr>
+          <w:rFonts w:asciiTheme="majorBidi" w:hAnsiTheme="majorBidi" w:cstheme="majorBidi"/>
+        </w:rPr>
+        <w:t xml:space="preserve">, </w:t>
+      </w:r>
+      <w:proofErr w:type="spellStart"/>
+      <w:r>
+        <w:rPr>
+          <w:rFonts w:asciiTheme="majorBidi" w:hAnsiTheme="majorBidi" w:cstheme="majorBidi"/>
+        </w:rPr>
+        <w:t>InvalidPaymentException</w:t>
+      </w:r>
+      <w:proofErr w:type="spellEnd"/>
+      <w:r>
+        <w:rPr>
+          <w:rFonts w:asciiTheme="majorBidi" w:hAnsiTheme="majorBidi" w:cstheme="majorBidi"/>
+        </w:rPr>
+        <w:t xml:space="preserve">), ensuring predictable </w:t>
+      </w:r>
+      <w:proofErr w:type="gramStart"/>
+      <w:r>
+        <w:rPr>
+          <w:rFonts w:asciiTheme="majorBidi" w:hAnsiTheme="majorBidi" w:cstheme="majorBidi"/>
+        </w:rPr>
+        <w:t>error</w:t>
+      </w:r>
+      <w:proofErr w:type="gramEnd"/>
     </w:p>
     <w:p>
       <w:pPr>
@@ -920,7 +1165,21 @@
         <w:rPr>
           <w:rFonts w:asciiTheme="majorBidi" w:hAnsiTheme="majorBidi" w:cstheme="majorBidi"/>
         </w:rPr>
-        <w:t>resolution without thread termination. Developed the ReceptionistMenu interface to facilitate front-desk operations and staff-managed check-in/check-out flows.</w:t>
+        <w:t xml:space="preserve">resolution without thread termination. Developed the </w:t>
+      </w:r>
+      <w:proofErr w:type="spellStart"/>
+      <w:r>
+        <w:rPr>
+          <w:rFonts w:asciiTheme="majorBidi" w:hAnsiTheme="majorBidi" w:cstheme="majorBidi"/>
+        </w:rPr>
+        <w:t>ReceptionistMenu</w:t>
+      </w:r>
+      <w:proofErr w:type="spellEnd"/>
+      <w:r>
+        <w:rPr>
+          <w:rFonts w:asciiTheme="majorBidi" w:hAnsiTheme="majorBidi" w:cstheme="majorBidi"/>
+        </w:rPr>
+        <w:t xml:space="preserve"> interface to facilitate front-desk operations and staff-managed check-in/check-out flows.</w:t>
       </w:r>
     </w:p>
     <w:p>
@@ -977,7 +1236,57 @@
         <w:rPr>
           <w:rFonts w:asciiTheme="majorBidi" w:hAnsiTheme="majorBidi" w:cstheme="majorBidi"/>
         </w:rPr>
-        <w:t>To act as the application's data store, the system utilizes a centralized HotelDatabase class. By implementing the Singleton pattern (getInstance()), the architecture guarantees that only one instance of the database exists in memory at any time. By leveraging static ArrayList collections for entities like Guests, Rooms, and Reservations, the application maintains a strict single source of truth. Updates made by an Admin are immediately reflected across the system. Dummy data is pre-populated to allow immediate testing.</w:t>
+        <w:t xml:space="preserve">To act as the application's data store, the system utilizes a centralized </w:t>
+      </w:r>
+      <w:proofErr w:type="spellStart"/>
+      <w:r>
+        <w:rPr>
+          <w:rFonts w:asciiTheme="majorBidi" w:hAnsiTheme="majorBidi" w:cstheme="majorBidi"/>
+        </w:rPr>
+        <w:t>HotelDatabase</w:t>
+      </w:r>
+      <w:proofErr w:type="spellEnd"/>
+      <w:r>
+        <w:rPr>
+          <w:rFonts w:asciiTheme="majorBidi" w:hAnsiTheme="majorBidi" w:cstheme="majorBidi"/>
+        </w:rPr>
+        <w:t xml:space="preserve"> class. By implementing the Singleton pattern (</w:t>
+      </w:r>
+      <w:proofErr w:type="spellStart"/>
+      <w:proofErr w:type="gramStart"/>
+      <w:r>
+        <w:rPr>
+          <w:rFonts w:asciiTheme="majorBidi" w:hAnsiTheme="majorBidi" w:cstheme="majorBidi"/>
+        </w:rPr>
+        <w:t>getInstance</w:t>
+      </w:r>
+      <w:proofErr w:type="spellEnd"/>
+      <w:r>
+        <w:rPr>
+          <w:rFonts w:asciiTheme="majorBidi" w:hAnsiTheme="majorBidi" w:cstheme="majorBidi"/>
+        </w:rPr>
+        <w:t>(</w:t>
+      </w:r>
+      <w:proofErr w:type="gramEnd"/>
+      <w:r>
+        <w:rPr>
+          <w:rFonts w:asciiTheme="majorBidi" w:hAnsiTheme="majorBidi" w:cstheme="majorBidi"/>
+        </w:rPr>
+        <w:t xml:space="preserve">)), the architecture guarantees that only one instance of the database exists in memory at any time. By leveraging static </w:t>
+      </w:r>
+      <w:proofErr w:type="spellStart"/>
+      <w:r>
+        <w:rPr>
+          <w:rFonts w:asciiTheme="majorBidi" w:hAnsiTheme="majorBidi" w:cstheme="majorBidi"/>
+        </w:rPr>
+        <w:t>ArrayList</w:t>
+      </w:r>
+      <w:proofErr w:type="spellEnd"/>
+      <w:r>
+        <w:rPr>
+          <w:rFonts w:asciiTheme="majorBidi" w:hAnsiTheme="majorBidi" w:cstheme="majorBidi"/>
+        </w:rPr>
+        <w:t xml:space="preserve"> collections for entities like Guests, Rooms, and Reservations, the application maintains a strict single source of truth. Updates made by an Admin are immediately reflected across the system. Dummy data is pre-populated to allow immediate testing.</w:t>
       </w:r>
     </w:p>
     <w:p>
@@ -1014,7 +1323,21 @@
         <w:rPr>
           <w:rFonts w:asciiTheme="majorBidi" w:hAnsiTheme="majorBidi" w:cstheme="majorBidi"/>
         </w:rPr>
-        <w:t>Query logic is completely decoupled from data storage. A dedicated HotelDatabaseSearch utility class handles all complex search algorithms (e.g., verifying date overlaps, finding users by ID). This ensures the database class remains strictly a data container, improving maintainability.</w:t>
+        <w:t xml:space="preserve">Query logic is completely decoupled from data storage. A dedicated </w:t>
+      </w:r>
+      <w:proofErr w:type="spellStart"/>
+      <w:r>
+        <w:rPr>
+          <w:rFonts w:asciiTheme="majorBidi" w:hAnsiTheme="majorBidi" w:cstheme="majorBidi"/>
+        </w:rPr>
+        <w:t>HotelDatabaseSearch</w:t>
+      </w:r>
+      <w:proofErr w:type="spellEnd"/>
+      <w:r>
+        <w:rPr>
+          <w:rFonts w:asciiTheme="majorBidi" w:hAnsiTheme="majorBidi" w:cstheme="majorBidi"/>
+        </w:rPr>
+        <w:t xml:space="preserve"> utility class handles all complex search algorithms (e.g., verifying date overlaps, finding users by ID). This ensures the database class remains strictly a data container, improving maintainability.</w:t>
       </w:r>
     </w:p>
     <w:p>
@@ -1103,7 +1426,63 @@
         <w:rPr>
           <w:rFonts w:asciiTheme="majorBidi" w:hAnsiTheme="majorBidi" w:cstheme="majorBidi"/>
         </w:rPr>
-        <w:t xml:space="preserve"> Command Line Interface is broken down into highly modular packages (AdminRoomMenu, GuestMenu, ViewData) rather than a single monolithic file. To ensure system stability, Scanner objects are instantiated once and passed by reference, while all execution loops are wrapped in try-catch blocks. This prevents NoSuchElementException crashes when users input invalid data types.</w:t>
+        <w:t xml:space="preserve"> Command Line Interface is broken down into highly modular packages (</w:t>
+      </w:r>
+      <w:proofErr w:type="spellStart"/>
+      <w:r>
+        <w:rPr>
+          <w:rFonts w:asciiTheme="majorBidi" w:hAnsiTheme="majorBidi" w:cstheme="majorBidi"/>
+        </w:rPr>
+        <w:t>AdminRoomMenu</w:t>
+      </w:r>
+      <w:proofErr w:type="spellEnd"/>
+      <w:r>
+        <w:rPr>
+          <w:rFonts w:asciiTheme="majorBidi" w:hAnsiTheme="majorBidi" w:cstheme="majorBidi"/>
+        </w:rPr>
+        <w:t xml:space="preserve">, </w:t>
+      </w:r>
+      <w:proofErr w:type="spellStart"/>
+      <w:r>
+        <w:rPr>
+          <w:rFonts w:asciiTheme="majorBidi" w:hAnsiTheme="majorBidi" w:cstheme="majorBidi"/>
+        </w:rPr>
+        <w:t>GuestMenu</w:t>
+      </w:r>
+      <w:proofErr w:type="spellEnd"/>
+      <w:r>
+        <w:rPr>
+          <w:rFonts w:asciiTheme="majorBidi" w:hAnsiTheme="majorBidi" w:cstheme="majorBidi"/>
+        </w:rPr>
+        <w:t xml:space="preserve">, </w:t>
+      </w:r>
+      <w:proofErr w:type="spellStart"/>
+      <w:r>
+        <w:rPr>
+          <w:rFonts w:asciiTheme="majorBidi" w:hAnsiTheme="majorBidi" w:cstheme="majorBidi"/>
+        </w:rPr>
+        <w:t>ViewData</w:t>
+      </w:r>
+      <w:proofErr w:type="spellEnd"/>
+      <w:r>
+        <w:rPr>
+          <w:rFonts w:asciiTheme="majorBidi" w:hAnsiTheme="majorBidi" w:cstheme="majorBidi"/>
+        </w:rPr>
+        <w:t xml:space="preserve">) rather than a single monolithic file. To ensure system stability, Scanner objects are instantiated once and passed by reference, while all execution loops are wrapped in try-catch blocks. This prevents </w:t>
+      </w:r>
+      <w:proofErr w:type="spellStart"/>
+      <w:r>
+        <w:rPr>
+          <w:rFonts w:asciiTheme="majorBidi" w:hAnsiTheme="majorBidi" w:cstheme="majorBidi"/>
+        </w:rPr>
+        <w:t>NoSuchElementException</w:t>
+      </w:r>
+      <w:proofErr w:type="spellEnd"/>
+      <w:r>
+        <w:rPr>
+          <w:rFonts w:asciiTheme="majorBidi" w:hAnsiTheme="majorBidi" w:cstheme="majorBidi"/>
+        </w:rPr>
+        <w:t xml:space="preserve"> crashes when users input invalid data types.</w:t>
       </w:r>
     </w:p>
     <w:p>
@@ -1132,7 +1511,35 @@
         <w:rPr>
           <w:rFonts w:asciiTheme="majorBidi" w:hAnsiTheme="majorBidi" w:cstheme="majorBidi"/>
         </w:rPr>
-        <w:t xml:space="preserve"> The system implements custom exceptions, specifically InvalidInputException and InvalidPaymentException. This creates a predictable, type-safe way to handle business-logic failures without crashing the application thread.</w:t>
+        <w:t xml:space="preserve"> The system implements custom exceptions, specifically </w:t>
+      </w:r>
+      <w:proofErr w:type="spellStart"/>
+      <w:r>
+        <w:rPr>
+          <w:rFonts w:asciiTheme="majorBidi" w:hAnsiTheme="majorBidi" w:cstheme="majorBidi"/>
+        </w:rPr>
+        <w:t>InvalidInputException</w:t>
+      </w:r>
+      <w:proofErr w:type="spellEnd"/>
+      <w:r>
+        <w:rPr>
+          <w:rFonts w:asciiTheme="majorBidi" w:hAnsiTheme="majorBidi" w:cstheme="majorBidi"/>
+        </w:rPr>
+        <w:t xml:space="preserve"> and </w:t>
+      </w:r>
+      <w:proofErr w:type="spellStart"/>
+      <w:r>
+        <w:rPr>
+          <w:rFonts w:asciiTheme="majorBidi" w:hAnsiTheme="majorBidi" w:cstheme="majorBidi"/>
+        </w:rPr>
+        <w:t>InvalidPaymentException</w:t>
+      </w:r>
+      <w:proofErr w:type="spellEnd"/>
+      <w:r>
+        <w:rPr>
+          <w:rFonts w:asciiTheme="majorBidi" w:hAnsiTheme="majorBidi" w:cstheme="majorBidi"/>
+        </w:rPr>
+        <w:t>. This creates a predictable, type-safe way to handle business-logic failures without crashing the application thread.</w:t>
       </w:r>
     </w:p>
     <w:p>
@@ -1161,7 +1568,57 @@
         <w:rPr>
           <w:rFonts w:asciiTheme="majorBidi" w:hAnsiTheme="majorBidi" w:cstheme="majorBidi"/>
         </w:rPr>
-        <w:t xml:space="preserve"> The system relies on java.time.LocalDate and ChronoUnit for precise, timezone-independent calculations. This is critical for determining reservation durations and multiplying the exact number of nights stayed by the room's base price.</w:t>
+        <w:t xml:space="preserve"> The system relies on </w:t>
+      </w:r>
+      <w:proofErr w:type="spellStart"/>
+      <w:proofErr w:type="gramStart"/>
+      <w:r>
+        <w:rPr>
+          <w:rFonts w:asciiTheme="majorBidi" w:hAnsiTheme="majorBidi" w:cstheme="majorBidi"/>
+        </w:rPr>
+        <w:t>java.time</w:t>
+      </w:r>
+      <w:proofErr w:type="gramEnd"/>
+      <w:r>
+        <w:rPr>
+          <w:rFonts w:asciiTheme="majorBidi" w:hAnsiTheme="majorBidi" w:cstheme="majorBidi"/>
+        </w:rPr>
+        <w:t>.LocalDate</w:t>
+      </w:r>
+      <w:proofErr w:type="spellEnd"/>
+      <w:r>
+        <w:rPr>
+          <w:rFonts w:asciiTheme="majorBidi" w:hAnsiTheme="majorBidi" w:cstheme="majorBidi"/>
+        </w:rPr>
+        <w:t xml:space="preserve"> and </w:t>
+      </w:r>
+      <w:proofErr w:type="spellStart"/>
+      <w:r>
+        <w:rPr>
+          <w:rFonts w:asciiTheme="majorBidi" w:hAnsiTheme="majorBidi" w:cstheme="majorBidi"/>
+        </w:rPr>
+        <w:t>ChronoUnit</w:t>
+      </w:r>
+      <w:proofErr w:type="spellEnd"/>
+      <w:r>
+        <w:rPr>
+          <w:rFonts w:asciiTheme="majorBidi" w:hAnsiTheme="majorBidi" w:cstheme="majorBidi"/>
+        </w:rPr>
+        <w:t xml:space="preserve"> for precise, </w:t>
+      </w:r>
+      <w:proofErr w:type="spellStart"/>
+      <w:r>
+        <w:rPr>
+          <w:rFonts w:asciiTheme="majorBidi" w:hAnsiTheme="majorBidi" w:cstheme="majorBidi"/>
+        </w:rPr>
+        <w:t>timezone</w:t>
+      </w:r>
+      <w:proofErr w:type="spellEnd"/>
+      <w:r>
+        <w:rPr>
+          <w:rFonts w:asciiTheme="majorBidi" w:hAnsiTheme="majorBidi" w:cstheme="majorBidi"/>
+        </w:rPr>
+        <w:t>-independent calculations. This is critical for determining reservation durations and multiplying the exact number of nights stayed by the room's base price.</w:t>
       </w:r>
     </w:p>
     <w:p>
@@ -1350,7 +1807,21 @@
         <w:rPr>
           <w:rFonts w:asciiTheme="majorBidi" w:hAnsiTheme="majorBidi" w:cstheme="majorBidi"/>
         </w:rPr>
-        <w:t xml:space="preserve"> A Guest selects an available room and provides valid future dates for check-in and check-out. The system calculates the stay duration, checks the HotelDatabaseSearch overlap algorithm, updates the room's availability, and assigns an ID.</w:t>
+        <w:t xml:space="preserve"> A Guest selects an available room and provides valid future dates for check-in and check-out. The system calculates the stay duration, checks the </w:t>
+      </w:r>
+      <w:proofErr w:type="spellStart"/>
+      <w:r>
+        <w:rPr>
+          <w:rFonts w:asciiTheme="majorBidi" w:hAnsiTheme="majorBidi" w:cstheme="majorBidi"/>
+        </w:rPr>
+        <w:t>HotelDatabaseSearch</w:t>
+      </w:r>
+      <w:proofErr w:type="spellEnd"/>
+      <w:r>
+        <w:rPr>
+          <w:rFonts w:asciiTheme="majorBidi" w:hAnsiTheme="majorBidi" w:cstheme="majorBidi"/>
+        </w:rPr>
+        <w:t xml:space="preserve"> overlap algorithm, updates the room's availability, and assigns an ID.</w:t>
       </w:r>
     </w:p>
     <w:p>
@@ -1377,7 +1848,21 @@
         <w:rPr>
           <w:rFonts w:asciiTheme="majorBidi" w:hAnsiTheme="majorBidi" w:cstheme="majorBidi"/>
         </w:rPr>
-        <w:t xml:space="preserve"> A Guest attempts to input a date format incorrectly (e.g., text instead of YYYY-MM-DD). The system catches the DateTimeParseException and safely re-prompts the user inside a validation loop, protecting the thread from crashing.</w:t>
+        <w:t xml:space="preserve"> A Guest attempts to input a date format incorrectly (e.g., text instead of YYYY-MM-DD). The system catches the </w:t>
+      </w:r>
+      <w:proofErr w:type="spellStart"/>
+      <w:r>
+        <w:rPr>
+          <w:rFonts w:asciiTheme="majorBidi" w:hAnsiTheme="majorBidi" w:cstheme="majorBidi"/>
+        </w:rPr>
+        <w:t>DateTimeParseException</w:t>
+      </w:r>
+      <w:proofErr w:type="spellEnd"/>
+      <w:r>
+        <w:rPr>
+          <w:rFonts w:asciiTheme="majorBidi" w:hAnsiTheme="majorBidi" w:cstheme="majorBidi"/>
+        </w:rPr>
+        <w:t xml:space="preserve"> and safely re-prompts the user inside a validation loop, protecting the thread from crashing.</w:t>
       </w:r>
     </w:p>
     <w:p>
@@ -1478,7 +1963,49 @@
         <w:rPr>
           <w:rFonts w:asciiTheme="majorBidi" w:hAnsiTheme="majorBidi" w:cstheme="majorBidi"/>
         </w:rPr>
-        <w:t xml:space="preserve"> A user attempts to checkout a reservation still marked as PENDING. The system throws a custom InvalidCheckOutException and safely aborts the checkout process.</w:t>
+        <w:t xml:space="preserve"> A user attempts to </w:t>
+      </w:r>
+      <w:proofErr w:type="gramStart"/>
+      <w:r>
+        <w:rPr>
+          <w:rFonts w:asciiTheme="majorBidi" w:hAnsiTheme="majorBidi" w:cstheme="majorBidi"/>
+        </w:rPr>
+        <w:t>checkout</w:t>
+      </w:r>
+      <w:proofErr w:type="gramEnd"/>
+      <w:r>
+        <w:rPr>
+          <w:rFonts w:asciiTheme="majorBidi" w:hAnsiTheme="majorBidi" w:cstheme="majorBidi"/>
+        </w:rPr>
+        <w:t xml:space="preserve"> a reservation still marked as PENDING. The system throws a </w:t>
+      </w:r>
+      <w:proofErr w:type="gramStart"/>
+      <w:r>
+        <w:rPr>
+          <w:rFonts w:asciiTheme="majorBidi" w:hAnsiTheme="majorBidi" w:cstheme="majorBidi"/>
+        </w:rPr>
+        <w:t>custom</w:t>
+      </w:r>
+      <w:proofErr w:type="gramEnd"/>
+      <w:r>
+        <w:rPr>
+          <w:rFonts w:asciiTheme="majorBidi" w:hAnsiTheme="majorBidi" w:cstheme="majorBidi"/>
+        </w:rPr>
+        <w:t xml:space="preserve"> </w:t>
+      </w:r>
+      <w:proofErr w:type="spellStart"/>
+      <w:r>
+        <w:rPr>
+          <w:rFonts w:asciiTheme="majorBidi" w:hAnsiTheme="majorBidi" w:cstheme="majorBidi"/>
+        </w:rPr>
+        <w:t>InvalidCheckOutException</w:t>
+      </w:r>
+      <w:proofErr w:type="spellEnd"/>
+      <w:r>
+        <w:rPr>
+          <w:rFonts w:asciiTheme="majorBidi" w:hAnsiTheme="majorBidi" w:cstheme="majorBidi"/>
+        </w:rPr>
+        <w:t xml:space="preserve"> and safely aborts the checkout process.</w:t>
       </w:r>
     </w:p>
     <w:p>
@@ -1673,7 +2200,21 @@
         <w:rPr>
           <w:rFonts w:asciiTheme="majorBidi" w:hAnsiTheme="majorBidi" w:cstheme="majorBidi"/>
         </w:rPr>
-        <w:t xml:space="preserve"> The system currently relies on a temporary console-based menu using Scanner(System.in). This will be replaced by a JavaFX GUI in Milestone 2.</w:t>
+        <w:t xml:space="preserve"> The system currently relies on a temporary console-based menu using </w:t>
+      </w:r>
+      <w:proofErr w:type="gramStart"/>
+      <w:r>
+        <w:rPr>
+          <w:rFonts w:asciiTheme="majorBidi" w:hAnsiTheme="majorBidi" w:cstheme="majorBidi"/>
+        </w:rPr>
+        <w:t>Scanner(</w:t>
+      </w:r>
+      <w:proofErr w:type="gramEnd"/>
+      <w:r>
+        <w:rPr>
+          <w:rFonts w:asciiTheme="majorBidi" w:hAnsiTheme="majorBidi" w:cstheme="majorBidi"/>
+        </w:rPr>
+        <w:t>System.in). This will be replaced by a JavaFX GUI in Milestone 2.</w:t>
       </w:r>
     </w:p>
     <w:p>
@@ -1746,7 +2287,23 @@
         <w:rPr>
           <w:rFonts w:asciiTheme="majorBidi" w:hAnsiTheme="majorBidi" w:cstheme="majorBidi"/>
         </w:rPr>
-        <w:t xml:space="preserve"> The current iteration does not support multi-threading for asynchronous background tasks, which will be implemented in the second milestone aswell.</w:t>
+        <w:t xml:space="preserve"> The current iteration does not support multi-threading for asynchronous background tasks, which will be implemented in the second milestone </w:t>
+      </w:r>
+      <w:proofErr w:type="spellStart"/>
+      <w:proofErr w:type="gramStart"/>
+      <w:r>
+        <w:rPr>
+          <w:rFonts w:asciiTheme="majorBidi" w:hAnsiTheme="majorBidi" w:cstheme="majorBidi"/>
+        </w:rPr>
+        <w:t>aswell</w:t>
+      </w:r>
+      <w:proofErr w:type="spellEnd"/>
+      <w:proofErr w:type="gramEnd"/>
+      <w:r>
+        <w:rPr>
+          <w:rFonts w:asciiTheme="majorBidi" w:hAnsiTheme="majorBidi" w:cstheme="majorBidi"/>
+        </w:rPr>
+        <w:t>.</w:t>
       </w:r>
     </w:p>
     <w:p>
@@ -3142,7 +3699,6 @@
   <w:style w:type="character" w:default="1" w:styleId="DefaultParagraphFont">
     <w:name w:val="Default Paragraph Font"/>
     <w:uiPriority w:val="1"/>
-    <w:semiHidden/>
     <w:unhideWhenUsed/>
   </w:style>
   <w:style w:type="table" w:default="1" w:styleId="TableNormal">
@@ -3454,6 +4010,41 @@
       <w:smallCaps/>
       <w:color w:val="0F4761" w:themeColor="accent1" w:themeShade="BF"/>
       <w:spacing w:val="5"/>
+    </w:rPr>
+  </w:style>
+  <w:style w:type="character" w:styleId="Hyperlink">
+    <w:name w:val="Hyperlink"/>
+    <w:basedOn w:val="DefaultParagraphFont"/>
+    <w:uiPriority w:val="99"/>
+    <w:unhideWhenUsed/>
+    <w:rsid w:val="00BA4F0B"/>
+    <w:rPr>
+      <w:color w:val="467886" w:themeColor="hyperlink"/>
+      <w:u w:val="single"/>
+    </w:rPr>
+  </w:style>
+  <w:style w:type="character" w:styleId="UnresolvedMention">
+    <w:name w:val="Unresolved Mention"/>
+    <w:basedOn w:val="DefaultParagraphFont"/>
+    <w:uiPriority w:val="99"/>
+    <w:semiHidden/>
+    <w:unhideWhenUsed/>
+    <w:rsid w:val="00BA4F0B"/>
+    <w:rPr>
+      <w:color w:val="605E5C"/>
+      <w:shd w:val="clear" w:color="auto" w:fill="E1DFDD"/>
+    </w:rPr>
+  </w:style>
+  <w:style w:type="character" w:styleId="FollowedHyperlink">
+    <w:name w:val="FollowedHyperlink"/>
+    <w:basedOn w:val="DefaultParagraphFont"/>
+    <w:uiPriority w:val="99"/>
+    <w:semiHidden/>
+    <w:unhideWhenUsed/>
+    <w:rsid w:val="00BA4F0B"/>
+    <w:rPr>
+      <w:color w:val="96607D" w:themeColor="followedHyperlink"/>
+      <w:u w:val="single"/>
     </w:rPr>
   </w:style>
 </w:styles>

</xml_diff>